<commit_message>
Update cover page layout, institution crest, and academic metadata
</commit_message>
<xml_diff>
--- a/docs/HydroFlow_OS_Project_Report.docx
+++ b/docs/HydroFlow_OS_Project_Report.docx
@@ -117,7 +117,7 @@
                 <w:b/>
                 <w:sz w:val="19"/>
               </w:rPr>
-              <w:t>Course Title</w:t>
+              <w:t>Course Title &amp; Code</w:t>
             </w:r>
           </w:p>
         </w:tc>
@@ -146,7 +146,7 @@
                 <w:b/>
                 <w:sz w:val="19"/>
               </w:rPr>
-              <w:t>Course Faculty / Evaluator</w:t>
+              <w:t>Academic Term</w:t>
             </w:r>
           </w:p>
         </w:tc>
@@ -159,7 +159,7 @@
               <w:rPr>
                 <w:sz w:val="19"/>
               </w:rPr>
-              <w:t>Dr. Muthusundari</w:t>
+              <w:t>Fall Semester 2026 to 2027</w:t>
             </w:r>
           </w:p>
         </w:tc>
@@ -436,7 +436,7 @@
     </w:p>
     <w:p>
       <w:r>
-        <w:t>Collection choices match physical operational access patterns. LinkedHashMap maintains insertion order during network audits while providing O(1) asset lookups by tag. PriorityQueue sorts storage reservoirs by fill ratio, ensuring depleted reservoirs receive immediate refilling access.</w:t>
+        <w:t>Collection choices match physical operational access patterns. LinkedHashMap maintains insertion order during network audits while providing O(1) asset lookups by tag. PriorityQueue sorts storage reservoirs by fill ratio, so depleted reservoirs receive immediate refilling access.</w:t>
       </w:r>
     </w:p>
     <w:p>
@@ -506,7 +506,7 @@
         <w:br/>
         <w:t xml:space="preserve">   Evaluated Course Project | CSE2006 Programming in Java | VIT Bhopal          </w:t>
         <w:br/>
-        <w:t xml:space="preserve">   Student: Mayank Chaudhary (24BEC10011) | Faculty: Dr. Muthusundari           </w:t>
+        <w:t xml:space="preserve">   Student: Mayank Chaudhary (24BEC10011) | Term: Fall Semester 2026-2027       </w:t>
         <w:br/>
         <w:t>================================================================================</w:t>
         <w:br/>
@@ -560,7 +560,7 @@
         <w:br/>
         <w:t>&gt;&gt;&gt; [PHASE 6: MULTITHREADED SENSOR TELEMETRY WORKER]</w:t>
         <w:br/>
-        <w:t>Telemetry worker joined successfully. Generated 5 sensor packets:</w:t>
+        <w:t>Telemetry worker joined successfully. Emitted 5 sensor packets:</w:t>
         <w:br/>
         <w:t xml:space="preserve">  [1789655500660] Node: SENS-NODE-77 | P: 4.61 bar | Q: 55.2 L/s | Turbidity: 0.49 NTU | Cl: 1.26 ppm</w:t>
         <w:br/>
@@ -618,7 +618,7 @@
     </w:p>
     <w:p>
       <w:r>
-        <w:t>Third, standard JUnit testing requires build tool wrappers such as Maven or Gradle, which introduces environment dependency risks during automated assessment; writing a standalone test suite in HydroFlowTestSuite.java using native Java assertions (-ea) kept the build portable across JDK installations. Fourth, writing persistent reservoir CSV records and telemetry logs concurrently risked descriptor leakage during abnormal exits, which was resolved by wrapping all FileWriter and BufferedWriter operations in try-with-resources blocks.</w:t>
+        <w:t>Third, standard JUnit testing requires build tool wrappers such as Maven or Gradle, which introduces environment dependency risks during lab evaluation; writing a standalone test suite in HydroFlowTestSuite.java using native Java assertions (-ea) kept the build portable across JDK installations. Fourth, writing persistent reservoir CSV records and telemetry logs concurrently risked descriptor leakage during abnormal exits, which was resolved by wrapping all FileWriter and BufferedWriter operations in try-with-resources blocks.</w:t>
       </w:r>
     </w:p>
     <w:p>

</xml_diff>

<commit_message>
Add college email and student metadata to documentation
</commit_message>
<xml_diff>
--- a/docs/HydroFlow_OS_Project_Report.docx
+++ b/docs/HydroFlow_OS_Project_Report.docx
@@ -102,6 +102,35 @@
                 <w:sz w:val="19"/>
               </w:rPr>
               <w:t>24BEC10011</w:t>
+            </w:r>
+          </w:p>
+        </w:tc>
+      </w:tr>
+      <w:tr>
+        <w:tc>
+          <w:tcPr>
+            <w:tcW w:type="dxa" w:w="4946"/>
+          </w:tcPr>
+          <w:p>
+            <w:r>
+              <w:rPr>
+                <w:b/>
+                <w:sz w:val="19"/>
+              </w:rPr>
+              <w:t>College Email</w:t>
+            </w:r>
+          </w:p>
+        </w:tc>
+        <w:tc>
+          <w:tcPr>
+            <w:tcW w:type="dxa" w:w="4946"/>
+          </w:tcPr>
+          <w:p>
+            <w:r>
+              <w:rPr>
+                <w:sz w:val="19"/>
+              </w:rPr>
+              <w:t>mayank.24bec10011@vitbhopal.ac.in</w:t>
             </w:r>
           </w:p>
         </w:tc>

</xml_diff>